<commit_message>
Fix Unit 6 programming assignment: correct salaryList to 10 entries, update date, polish explanations
</commit_message>
<xml_diff>
--- a/CS1101_Programming_Fundamentals/Unit6_Lists/Assignment/Unit6_Programming_Assignment.docx
+++ b/CS1101_Programming_Fundamentals/Unit6_Lists/Assignment/Unit6_Programming_Assignment.docx
@@ -2,7 +2,7 @@
 <file path=word/document.xml><?xml version="1.0" encoding="utf-8"?>
 <w:document xmlns:w="http://schemas.openxmlformats.org/wordprocessingml/2006/main" xmlns:m="http://schemas.openxmlformats.org/officeDocument/2006/math" xmlns:r="http://schemas.openxmlformats.org/officeDocument/2006/relationships" xmlns:o="urn:schemas-microsoft-com:office:office" xmlns:v="urn:schemas-microsoft-com:vml" xmlns:w10="urn:schemas-microsoft-com:office:word" xmlns:a="http://schemas.openxmlformats.org/drawingml/2006/main" xmlns:pic="http://schemas.openxmlformats.org/drawingml/2006/picture" xmlns:wp="http://schemas.openxmlformats.org/drawingml/2006/wordprocessingDrawing">
   <w:body>
-    <w:bookmarkStart w:id="21" w:name="cs1101-unit-6-programming-assignment"/>
+    <w:bookmarkStart w:id="19" w:name="cs1101-unit-6-programming-assignment"/>
     <w:p>
       <w:pPr>
         <w:pStyle w:val="Heading1"/>
@@ -104,7 +104,7 @@
           <w:rFonts w:ascii="Times New Roman" w:hAnsi="Times New Roman"/>
           <w:sz w:val="24"/>
         </w:rPr>
-        <w:t xml:space="preserve">: February 2026</w:t>
+        <w:t xml:space="preserve">: March 2026</w:t>
       </w:r>
     </w:p>
     <w:p>
@@ -121,7 +121,7 @@
         </w:pict>
       </w:r>
     </w:p>
-    <w:bookmarkStart w:id="16" w:name="part-a-employee-list-operations"/>
+    <w:bookmarkStart w:id="15" w:name="part-a-employee-list-operations"/>
     <w:p>
       <w:pPr>
         <w:pStyle w:val="Heading2"/>
@@ -135,20 +135,6 @@
         <w:t xml:space="preserve">Part (a): Employee List Operations</w:t>
       </w:r>
     </w:p>
-    <w:bookmarkStart w:id="9" w:name="overview"/>
-    <w:p>
-      <w:pPr>
-        <w:pStyle w:val="Heading3"/>
-        <w:spacing w:line="480" w:lineRule="auto"/>
-      </w:pPr>
-      <w:r>
-        <w:rPr>
-          <w:rFonts w:ascii="Times New Roman" w:hAnsi="Times New Roman"/>
-          <w:sz w:val="24"/>
-        </w:rPr>
-        <w:t xml:space="preserve">Overview</w:t>
-      </w:r>
-    </w:p>
     <w:p>
       <w:pPr>
         <w:pStyle w:val="FirstParagraph"/>
@@ -159,7 +145,7 @@
           <w:rFonts w:ascii="Times New Roman" w:hAnsi="Times New Roman"/>
           <w:sz w:val="24"/>
         </w:rPr>
-        <w:t xml:space="preserve">This section demonstrates list creation, slicing, appending, deletion, merging, in-place modification with a loop, and sorting — all core list operations covered in Chapter 10 of Downey (2015).</w:t>
+        <w:t xml:space="preserve">This section demonstrates six sequential list operations on an HR employee dataset: slicing, appending, deletion, merging, in-place updating, and sorting. All operations use Python list features covered in Chapter 10 of Downey (2015).</w:t>
       </w:r>
     </w:p>
     <w:p>
@@ -176,8 +162,7 @@
         </w:pict>
       </w:r>
     </w:p>
-    <w:bookmarkEnd w:id="9"/>
-    <w:bookmarkStart w:id="10" w:name="Xdddbac6a0f34f01e5f304cf5b27dbd2600801e9"/>
+    <w:bookmarkStart w:id="9" w:name="Xdddbac6a0f34f01e5f304cf5b27dbd2600801e9"/>
     <w:p>
       <w:pPr>
         <w:pStyle w:val="Heading3"/>
@@ -188,7 +173,7 @@
           <w:rFonts w:ascii="Times New Roman" w:hAnsi="Times New Roman"/>
           <w:sz w:val="24"/>
         </w:rPr>
-        <w:t xml:space="preserve">Step 1: Create the Employee List and Split into Sub-Lists</w:t>
+        <w:t xml:space="preserve">Step 1 — Create the Employee List and Split into Sub-Lists</w:t>
       </w:r>
     </w:p>
     <w:p>
@@ -201,7 +186,7 @@
           <w:rFonts w:ascii="Times New Roman" w:hAnsi="Times New Roman"/>
           <w:sz w:val="24"/>
         </w:rPr>
-        <w:t xml:space="preserve">A list of 10 employee names is created, then split into two sub-lists of 5 using slice notation. Slicing with</w:t>
+        <w:t xml:space="preserve">A list of 10 employee names is defined, then divided into two equal sub-lists using slice notation.</w:t>
       </w:r>
       <w:r>
         <w:rPr>
@@ -216,21 +201,21 @@
           <w:rFonts w:ascii="Times New Roman" w:hAnsi="Times New Roman"/>
           <w:sz w:val="24"/>
         </w:rPr>
-        <w:t xml:space="preserve">[:5]</w:t>
-      </w:r>
-      <w:r>
-        <w:rPr>
-          <w:rFonts w:ascii="Times New Roman" w:hAnsi="Times New Roman"/>
-          <w:sz w:val="24"/>
-        </w:rPr>
-        <w:t xml:space="preserve"> </w:t>
-      </w:r>
-      <w:r>
-        <w:rPr>
-          <w:rFonts w:ascii="Times New Roman" w:hAnsi="Times New Roman"/>
-          <w:sz w:val="24"/>
-        </w:rPr>
-        <w:t xml:space="preserve">extracts indices 0–4 and</w:t>
+        <w:t xml:space="preserve">employees[:5]</w:t>
+      </w:r>
+      <w:r>
+        <w:rPr>
+          <w:rFonts w:ascii="Times New Roman" w:hAnsi="Times New Roman"/>
+          <w:sz w:val="24"/>
+        </w:rPr>
+        <w:t xml:space="preserve"> </w:t>
+      </w:r>
+      <w:r>
+        <w:rPr>
+          <w:rFonts w:ascii="Times New Roman" w:hAnsi="Times New Roman"/>
+          <w:sz w:val="24"/>
+        </w:rPr>
+        <w:t xml:space="preserve">extracts indices 0 through 4 into</w:t>
       </w:r>
       <w:r>
         <w:rPr>
@@ -245,21 +230,65 @@
           <w:rFonts w:ascii="Times New Roman" w:hAnsi="Times New Roman"/>
           <w:sz w:val="24"/>
         </w:rPr>
-        <w:t xml:space="preserve">[5:]</w:t>
-      </w:r>
-      <w:r>
-        <w:rPr>
-          <w:rFonts w:ascii="Times New Roman" w:hAnsi="Times New Roman"/>
-          <w:sz w:val="24"/>
-        </w:rPr>
-        <w:t xml:space="preserve"> </w:t>
-      </w:r>
-      <w:r>
-        <w:rPr>
-          <w:rFonts w:ascii="Times New Roman" w:hAnsi="Times New Roman"/>
-          <w:sz w:val="24"/>
-        </w:rPr>
-        <w:t xml:space="preserve">extracts indices 5–9, producing two independent sub-lists (Downey, 2015, p. 100).</w:t>
+        <w:t xml:space="preserve">subList1</w:t>
+      </w:r>
+      <w:r>
+        <w:rPr>
+          <w:rFonts w:ascii="Times New Roman" w:hAnsi="Times New Roman"/>
+          <w:sz w:val="24"/>
+        </w:rPr>
+        <w:t xml:space="preserve">, and</w:t>
+      </w:r>
+      <w:r>
+        <w:rPr>
+          <w:rFonts w:ascii="Times New Roman" w:hAnsi="Times New Roman"/>
+          <w:sz w:val="24"/>
+        </w:rPr>
+        <w:t xml:space="preserve"> </w:t>
+      </w:r>
+      <w:r>
+        <w:rPr>
+          <w:rStyle w:val="VerbatimChar"/>
+          <w:rFonts w:ascii="Times New Roman" w:hAnsi="Times New Roman"/>
+          <w:sz w:val="24"/>
+        </w:rPr>
+        <w:t xml:space="preserve">employees[5:]</w:t>
+      </w:r>
+      <w:r>
+        <w:rPr>
+          <w:rFonts w:ascii="Times New Roman" w:hAnsi="Times New Roman"/>
+          <w:sz w:val="24"/>
+        </w:rPr>
+        <w:t xml:space="preserve"> </w:t>
+      </w:r>
+      <w:r>
+        <w:rPr>
+          <w:rFonts w:ascii="Times New Roman" w:hAnsi="Times New Roman"/>
+          <w:sz w:val="24"/>
+        </w:rPr>
+        <w:t xml:space="preserve">extracts indices 5 through 9 into</w:t>
+      </w:r>
+      <w:r>
+        <w:rPr>
+          <w:rFonts w:ascii="Times New Roman" w:hAnsi="Times New Roman"/>
+          <w:sz w:val="24"/>
+        </w:rPr>
+        <w:t xml:space="preserve"> </w:t>
+      </w:r>
+      <w:r>
+        <w:rPr>
+          <w:rStyle w:val="VerbatimChar"/>
+          <w:rFonts w:ascii="Times New Roman" w:hAnsi="Times New Roman"/>
+          <w:sz w:val="24"/>
+        </w:rPr>
+        <w:t xml:space="preserve">subList2</w:t>
+      </w:r>
+      <w:r>
+        <w:rPr>
+          <w:rFonts w:ascii="Times New Roman" w:hAnsi="Times New Roman"/>
+          <w:sz w:val="24"/>
+        </w:rPr>
+        <w:t xml:space="preserve">. Slicing creates new independent list objects — modifying one sub-list does not affect the other or the original (Downey, 2015, p. 100).</w:t>
       </w:r>
     </w:p>
     <w:p>
@@ -540,7 +569,15 @@
           <w:rFonts w:ascii="Times New Roman" w:hAnsi="Times New Roman"/>
           <w:sz w:val="24"/>
         </w:rPr>
-        <w:t xml:space="preserve">]</w:t>
+        <w:t xml:space="preserve">]   </w:t>
+      </w:r>
+      <w:r>
+        <w:rPr>
+          <w:rStyle w:val="CommentTok"/>
+          <w:rFonts w:ascii="Times New Roman" w:hAnsi="Times New Roman"/>
+          <w:sz w:val="24"/>
+        </w:rPr>
+        <w:t xml:space="preserve"># indices 0-4</w:t>
       </w:r>
       <w:r>
         <w:rPr>
@@ -587,7 +624,22 @@
           <w:rFonts w:ascii="Times New Roman" w:hAnsi="Times New Roman"/>
           <w:sz w:val="24"/>
         </w:rPr>
-        <w:t xml:space="preserve">:]</w:t>
+        <w:t xml:space="preserve">:]   </w:t>
+      </w:r>
+      <w:r>
+        <w:rPr>
+          <w:rStyle w:val="CommentTok"/>
+          <w:rFonts w:ascii="Times New Roman" w:hAnsi="Times New Roman"/>
+          <w:sz w:val="24"/>
+        </w:rPr>
+        <w:t xml:space="preserve"># indices 5-9</w:t>
+      </w:r>
+      <w:r>
+        <w:rPr>
+          <w:rFonts w:ascii="Times New Roman" w:hAnsi="Times New Roman"/>
+          <w:sz w:val="24"/>
+        </w:rPr>
+        <w:br/>
       </w:r>
       <w:r>
         <w:rPr>
@@ -733,8 +785,8 @@
         </w:pict>
       </w:r>
     </w:p>
-    <w:bookmarkEnd w:id="10"/>
-    <w:bookmarkStart w:id="11" w:name="step-2-add-new-employee-to-sublist2"/>
+    <w:bookmarkEnd w:id="9"/>
+    <w:bookmarkStart w:id="10" w:name="step-2-add-new-employee-to-sublist2"/>
     <w:p>
       <w:pPr>
         <w:pStyle w:val="Heading3"/>
@@ -745,7 +797,7 @@
           <w:rFonts w:ascii="Times New Roman" w:hAnsi="Times New Roman"/>
           <w:sz w:val="24"/>
         </w:rPr>
-        <w:t xml:space="preserve">Step 2: Add New Employee to subList2</w:t>
+        <w:t xml:space="preserve">Step 2 — Add New Employee to subList2</w:t>
       </w:r>
     </w:p>
     <w:p>
@@ -787,7 +839,29 @@
           <w:rFonts w:ascii="Times New Roman" w:hAnsi="Times New Roman"/>
           <w:sz w:val="24"/>
         </w:rPr>
-        <w:t xml:space="preserve">method adds a single element to the end of a list, modifying it in place. The new employee</w:t>
+        <w:t xml:space="preserve">method adds a single element to the end of a list, modifying it in place and returning</w:t>
+      </w:r>
+      <w:r>
+        <w:rPr>
+          <w:rFonts w:ascii="Times New Roman" w:hAnsi="Times New Roman"/>
+          <w:sz w:val="24"/>
+        </w:rPr>
+        <w:t xml:space="preserve"> </w:t>
+      </w:r>
+      <w:r>
+        <w:rPr>
+          <w:rStyle w:val="VerbatimChar"/>
+          <w:rFonts w:ascii="Times New Roman" w:hAnsi="Times New Roman"/>
+          <w:sz w:val="24"/>
+        </w:rPr>
+        <w:t xml:space="preserve">None</w:t>
+      </w:r>
+      <w:r>
+        <w:rPr>
+          <w:rFonts w:ascii="Times New Roman" w:hAnsi="Times New Roman"/>
+          <w:sz w:val="24"/>
+        </w:rPr>
+        <w:t xml:space="preserve">. The new hire</w:t>
       </w:r>
       <w:r>
         <w:rPr>
@@ -815,7 +889,7 @@
           <w:rFonts w:ascii="Times New Roman" w:hAnsi="Times New Roman"/>
           <w:sz w:val="24"/>
         </w:rPr>
-        <w:t xml:space="preserve">is added to</w:t>
+        <w:t xml:space="preserve">is appended to</w:t>
       </w:r>
       <w:r>
         <w:rPr>
@@ -837,7 +911,7 @@
           <w:rFonts w:ascii="Times New Roman" w:hAnsi="Times New Roman"/>
           <w:sz w:val="24"/>
         </w:rPr>
-        <w:t xml:space="preserve">.</w:t>
+        <w:t xml:space="preserve">, which now holds 6 names.</w:t>
       </w:r>
     </w:p>
     <w:p>
@@ -959,8 +1033,8 @@
         </w:pict>
       </w:r>
     </w:p>
-    <w:bookmarkEnd w:id="11"/>
-    <w:bookmarkStart w:id="12" w:name="X16471e055b161a9e7f6a10f37805f4d91907638"/>
+    <w:bookmarkEnd w:id="10"/>
+    <w:bookmarkStart w:id="11" w:name="Xf3bdf2784573f1c66ed9fe5bea5b02633b783ce"/>
     <w:p>
       <w:pPr>
         <w:pStyle w:val="Heading3"/>
@@ -971,7 +1045,7 @@
           <w:rFonts w:ascii="Times New Roman" w:hAnsi="Times New Roman"/>
           <w:sz w:val="24"/>
         </w:rPr>
-        <w:t xml:space="preserve">Step 3: Remove Second Employee from subList1</w:t>
+        <w:t xml:space="preserve">Step 3 — Remove the Second Employee from subList1</w:t>
       </w:r>
     </w:p>
     <w:p>
@@ -984,7 +1058,7 @@
           <w:rFonts w:ascii="Times New Roman" w:hAnsi="Times New Roman"/>
           <w:sz w:val="24"/>
         </w:rPr>
-        <w:t xml:space="preserve">The second employee is at index 1 (Python uses zero-based indexing). The</w:t>
+        <w:t xml:space="preserve">Python uses zero-based indexing, so the second employee is at index 1. The</w:t>
       </w:r>
       <w:r>
         <w:rPr>
@@ -1013,7 +1087,36 @@
           <w:rFonts w:ascii="Times New Roman" w:hAnsi="Times New Roman"/>
           <w:sz w:val="24"/>
         </w:rPr>
-        <w:t xml:space="preserve">statement removes the element at that index, shifting all subsequent elements left by one position.</w:t>
+        <w:t xml:space="preserve">statement removes the element at that index and shifts all subsequent elements one position to the left.</w:t>
+      </w:r>
+      <w:r>
+        <w:rPr>
+          <w:rFonts w:ascii="Times New Roman" w:hAnsi="Times New Roman"/>
+          <w:sz w:val="24"/>
+        </w:rPr>
+        <w:t xml:space="preserve"> </w:t>
+      </w:r>
+      <w:r>
+        <w:rPr>
+          <w:rStyle w:val="VerbatimChar"/>
+          <w:rFonts w:ascii="Times New Roman" w:hAnsi="Times New Roman"/>
+          <w:sz w:val="24"/>
+        </w:rPr>
+        <w:t xml:space="preserve">subList1</w:t>
+      </w:r>
+      <w:r>
+        <w:rPr>
+          <w:rFonts w:ascii="Times New Roman" w:hAnsi="Times New Roman"/>
+          <w:sz w:val="24"/>
+        </w:rPr>
+        <w:t xml:space="preserve"> </w:t>
+      </w:r>
+      <w:r>
+        <w:rPr>
+          <w:rFonts w:ascii="Times New Roman" w:hAnsi="Times New Roman"/>
+          <w:sz w:val="24"/>
+        </w:rPr>
+        <w:t xml:space="preserve">shrinks from 5 to 4 elements.</w:t>
       </w:r>
     </w:p>
     <w:p>
@@ -1051,7 +1154,15 @@
           <w:rFonts w:ascii="Times New Roman" w:hAnsi="Times New Roman"/>
           <w:sz w:val="24"/>
         </w:rPr>
-        <w:t xml:space="preserve">]</w:t>
+        <w:t xml:space="preserve">]   </w:t>
+      </w:r>
+      <w:r>
+        <w:rPr>
+          <w:rStyle w:val="CommentTok"/>
+          <w:rFonts w:ascii="Times New Roman" w:hAnsi="Times New Roman"/>
+          <w:sz w:val="24"/>
+        </w:rPr>
+        <w:t xml:space="preserve"># removes 'Bob Martinez' (index 1)</w:t>
       </w:r>
       <w:r>
         <w:rPr>
@@ -1082,7 +1193,7 @@
           <w:rFonts w:ascii="Times New Roman" w:hAnsi="Times New Roman"/>
           <w:sz w:val="24"/>
         </w:rPr>
-        <w:t xml:space="preserve">"subList1 after removing 2nd employee:"</w:t>
+        <w:t xml:space="preserve">"subList1 after deletion:"</w:t>
       </w:r>
       <w:r>
         <w:rPr>
@@ -1126,63 +1237,7 @@
           <w:rFonts w:ascii="Times New Roman" w:hAnsi="Times New Roman"/>
           <w:sz w:val="24"/>
         </w:rPr>
-        <w:t xml:space="preserve">subList1 after removing 2nd employee: ['Alice Johnson', 'Carol White', 'David Lee', 'Emma Davis']</w:t>
-      </w:r>
-    </w:p>
-    <w:p>
-      <w:pPr>
-        <w:pStyle w:val="FirstParagraph"/>
-        <w:spacing w:line="480" w:lineRule="auto"/>
-      </w:pPr>
-      <w:r>
-        <w:rPr>
-          <w:rFonts w:ascii="Times New Roman" w:hAnsi="Times New Roman"/>
-          <w:sz w:val="24"/>
-        </w:rPr>
-        <w:t xml:space="preserve">‘Bob Martinez’</w:t>
-      </w:r>
-      <w:r>
-        <w:rPr>
-          <w:rFonts w:ascii="Times New Roman" w:hAnsi="Times New Roman"/>
-          <w:sz w:val="24"/>
-        </w:rPr>
-        <w:t xml:space="preserve"> </w:t>
-      </w:r>
-      <w:r>
-        <w:rPr>
-          <w:rFonts w:ascii="Times New Roman" w:hAnsi="Times New Roman"/>
-          <w:sz w:val="24"/>
-        </w:rPr>
-        <w:t xml:space="preserve">(index 1) is removed.</w:t>
-      </w:r>
-      <w:r>
-        <w:rPr>
-          <w:rFonts w:ascii="Times New Roman" w:hAnsi="Times New Roman"/>
-          <w:sz w:val="24"/>
-        </w:rPr>
-        <w:t xml:space="preserve"> </w:t>
-      </w:r>
-      <w:r>
-        <w:rPr>
-          <w:rStyle w:val="VerbatimChar"/>
-          <w:rFonts w:ascii="Times New Roman" w:hAnsi="Times New Roman"/>
-          <w:sz w:val="24"/>
-        </w:rPr>
-        <w:t xml:space="preserve">subList1</w:t>
-      </w:r>
-      <w:r>
-        <w:rPr>
-          <w:rFonts w:ascii="Times New Roman" w:hAnsi="Times New Roman"/>
-          <w:sz w:val="24"/>
-        </w:rPr>
-        <w:t xml:space="preserve"> </w:t>
-      </w:r>
-      <w:r>
-        <w:rPr>
-          <w:rFonts w:ascii="Times New Roman" w:hAnsi="Times New Roman"/>
-          <w:sz w:val="24"/>
-        </w:rPr>
-        <w:t xml:space="preserve">now contains 4 employees.</w:t>
+        <w:t xml:space="preserve">subList1 after deletion: ['Alice Johnson', 'Carol White', 'David Lee', 'Emma Davis']</w:t>
       </w:r>
     </w:p>
     <w:p>
@@ -1199,8 +1254,8 @@
         </w:pict>
       </w:r>
     </w:p>
-    <w:bookmarkEnd w:id="12"/>
-    <w:bookmarkStart w:id="13" w:name="step-4-merge-both-lists"/>
+    <w:bookmarkEnd w:id="11"/>
+    <w:bookmarkStart w:id="12" w:name="step-4-merge-both-lists"/>
     <w:p>
       <w:pPr>
         <w:pStyle w:val="Heading3"/>
@@ -1211,7 +1266,7 @@
           <w:rFonts w:ascii="Times New Roman" w:hAnsi="Times New Roman"/>
           <w:sz w:val="24"/>
         </w:rPr>
-        <w:t xml:space="preserve">Step 4: Merge Both Lists</w:t>
+        <w:t xml:space="preserve">Step 4 — Merge Both Lists</w:t>
       </w:r>
     </w:p>
     <w:p>
@@ -1253,7 +1308,7 @@
           <w:rFonts w:ascii="Times New Roman" w:hAnsi="Times New Roman"/>
           <w:sz w:val="24"/>
         </w:rPr>
-        <w:t xml:space="preserve">operator concatenates two lists, creating a new merged list.</w:t>
+        <w:t xml:space="preserve">operator concatenates two lists and returns a new list containing all elements of both operands in order.</w:t>
       </w:r>
       <w:r>
         <w:rPr>
@@ -1311,7 +1366,7 @@
           <w:rFonts w:ascii="Times New Roman" w:hAnsi="Times New Roman"/>
           <w:sz w:val="24"/>
         </w:rPr>
-        <w:t xml:space="preserve">(6 names, including Kriti Brown) combine into a 10-element list.</w:t>
+        <w:t xml:space="preserve">(6 names) merge into a 10-element list representing the current workforce.</w:t>
       </w:r>
     </w:p>
     <w:p>
@@ -1519,8 +1574,8 @@
         </w:pict>
       </w:r>
     </w:p>
-    <w:bookmarkEnd w:id="13"/>
-    <w:bookmarkStart w:id="14" w:name="step-5-apply-4-raise-to-salarylist"/>
+    <w:bookmarkEnd w:id="12"/>
+    <w:bookmarkStart w:id="13" w:name="step-5-apply-4-raise-to-salarylist"/>
     <w:p>
       <w:pPr>
         <w:pStyle w:val="Heading3"/>
@@ -1531,7 +1586,7 @@
           <w:rFonts w:ascii="Times New Roman" w:hAnsi="Times New Roman"/>
           <w:sz w:val="24"/>
         </w:rPr>
-        <w:t xml:space="preserve">Step 5: Apply 4% Raise to salaryList</w:t>
+        <w:t xml:space="preserve">Step 5 — Apply 4% Raise to salaryList</w:t>
       </w:r>
     </w:p>
     <w:p>
@@ -1573,7 +1628,7 @@
           <w:rFonts w:ascii="Times New Roman" w:hAnsi="Times New Roman"/>
           <w:sz w:val="24"/>
         </w:rPr>
-        <w:t xml:space="preserve">of 11 salaries (one per current employee) is defined. A</w:t>
+        <w:t xml:space="preserve">of 10 salaries — one per employee in the merged list — is defined. A</w:t>
       </w:r>
       <w:r>
         <w:rPr>
@@ -1602,7 +1657,7 @@
           <w:rFonts w:ascii="Times New Roman" w:hAnsi="Times New Roman"/>
           <w:sz w:val="24"/>
         </w:rPr>
-        <w:t xml:space="preserve">loop with</w:t>
+        <w:t xml:space="preserve">loop iterates over each index using</w:t>
       </w:r>
       <w:r>
         <w:rPr>
@@ -1624,14 +1679,7 @@
           <w:rFonts w:ascii="Times New Roman" w:hAnsi="Times New Roman"/>
           <w:sz w:val="24"/>
         </w:rPr>
-        <w:t xml:space="preserve"> </w:t>
-      </w:r>
-      <w:r>
-        <w:rPr>
-          <w:rFonts w:ascii="Times New Roman" w:hAnsi="Times New Roman"/>
-          <w:sz w:val="24"/>
-        </w:rPr>
-        <w:t xml:space="preserve">iterates over each index, multiplying each salary by</w:t>
+        <w:t xml:space="preserve">, multiplying each salary by</w:t>
       </w:r>
       <w:r>
         <w:rPr>
@@ -1660,7 +1708,7 @@
           <w:rFonts w:ascii="Times New Roman" w:hAnsi="Times New Roman"/>
           <w:sz w:val="24"/>
         </w:rPr>
-        <w:t xml:space="preserve">to apply a 4% raise and updating the element in place.</w:t>
+        <w:t xml:space="preserve">(a 4% increase) and writing the result back to the same index.</w:t>
       </w:r>
       <w:r>
         <w:rPr>
@@ -1689,7 +1737,7 @@
           <w:rFonts w:ascii="Times New Roman" w:hAnsi="Times New Roman"/>
           <w:sz w:val="24"/>
         </w:rPr>
-        <w:t xml:space="preserve">ensures clean two-decimal currency values.</w:t>
+        <w:t xml:space="preserve">ensures clean two-decimal currency values. Because lists are mutable, each index assignment updates the original list object in place (Downey, 2015, p. 97).</w:t>
       </w:r>
     </w:p>
     <w:p>
@@ -1872,22 +1920,6 @@
           <w:sz w:val="24"/>
         </w:rPr>
         <w:t xml:space="preserve">63000</w:t>
-      </w:r>
-      <w:r>
-        <w:rPr>
-          <w:rStyle w:val="NormalTok"/>
-          <w:rFonts w:ascii="Times New Roman" w:hAnsi="Times New Roman"/>
-          <w:sz w:val="24"/>
-        </w:rPr>
-        <w:t xml:space="preserve">, </w:t>
-      </w:r>
-      <w:r>
-        <w:rPr>
-          <w:rStyle w:val="DecValTok"/>
-          <w:rFonts w:ascii="Times New Roman" w:hAnsi="Times New Roman"/>
-          <w:sz w:val="24"/>
-        </w:rPr>
-        <w:t xml:space="preserve">45000</w:t>
       </w:r>
       <w:r>
         <w:rPr>
@@ -2205,7 +2237,7 @@
           <w:rFonts w:ascii="Times New Roman" w:hAnsi="Times New Roman"/>
           <w:sz w:val="24"/>
         </w:rPr>
-        <w:t xml:space="preserve">Salaries before raise: [52000, 61000, 47000, 73000, 55000, 68000, 49000, 82000, 57000, 63000, 45000]</w:t>
+        <w:t xml:space="preserve">Salaries before raise: [52000, 61000, 47000, 73000, 55000, 68000, 49000, 82000, 57000, 63000]</w:t>
       </w:r>
       <w:r>
         <w:rPr>
@@ -2220,49 +2252,7 @@
           <w:rFonts w:ascii="Times New Roman" w:hAnsi="Times New Roman"/>
           <w:sz w:val="24"/>
         </w:rPr>
-        <w:t xml:space="preserve">Salaries after 4% raise: [54080.0, 63440.0, 48880.0, 75920.0, 57200.0, 70720.0, 50960.0, 85280.0, 59280.0, 65520.0, 46800.0]</w:t>
-      </w:r>
-    </w:p>
-    <w:p>
-      <w:pPr>
-        <w:pStyle w:val="FirstParagraph"/>
-        <w:spacing w:line="480" w:lineRule="auto"/>
-      </w:pPr>
-      <w:r>
-        <w:rPr>
-          <w:rFonts w:ascii="Times New Roman" w:hAnsi="Times New Roman"/>
-          <w:sz w:val="24"/>
-        </w:rPr>
-        <w:t xml:space="preserve">Because lists are mutable, each</w:t>
-      </w:r>
-      <w:r>
-        <w:rPr>
-          <w:rFonts w:ascii="Times New Roman" w:hAnsi="Times New Roman"/>
-          <w:sz w:val="24"/>
-        </w:rPr>
-        <w:t xml:space="preserve"> </w:t>
-      </w:r>
-      <w:r>
-        <w:rPr>
-          <w:rStyle w:val="VerbatimChar"/>
-          <w:rFonts w:ascii="Times New Roman" w:hAnsi="Times New Roman"/>
-          <w:sz w:val="24"/>
-        </w:rPr>
-        <w:t xml:space="preserve">salaryList[i] = ...</w:t>
-      </w:r>
-      <w:r>
-        <w:rPr>
-          <w:rFonts w:ascii="Times New Roman" w:hAnsi="Times New Roman"/>
-          <w:sz w:val="24"/>
-        </w:rPr>
-        <w:t xml:space="preserve"> </w:t>
-      </w:r>
-      <w:r>
-        <w:rPr>
-          <w:rFonts w:ascii="Times New Roman" w:hAnsi="Times New Roman"/>
-          <w:sz w:val="24"/>
-        </w:rPr>
-        <w:t xml:space="preserve">assignment directly updates the element at that index in the original list.</w:t>
+        <w:t xml:space="preserve">Salaries after 4% raise: [54080.0, 63440.0, 48880.0, 75920.0, 57200.0, 70720.0, 50960.0, 85280.0, 59280.0, 65520.0]</w:t>
       </w:r>
     </w:p>
     <w:p>
@@ -2279,8 +2269,8 @@
         </w:pict>
       </w:r>
     </w:p>
-    <w:bookmarkEnd w:id="14"/>
-    <w:bookmarkStart w:id="15" w:name="step-6-sort-and-show-top-3-salaries"/>
+    <w:bookmarkEnd w:id="13"/>
+    <w:bookmarkStart w:id="14" w:name="Xc21a19ddf384425c7eec01017041c24621d37db"/>
     <w:p>
       <w:pPr>
         <w:pStyle w:val="Heading3"/>
@@ -2291,7 +2281,7 @@
           <w:rFonts w:ascii="Times New Roman" w:hAnsi="Times New Roman"/>
           <w:sz w:val="24"/>
         </w:rPr>
-        <w:t xml:space="preserve">Step 6: Sort and Show Top 3 Salaries</w:t>
+        <w:t xml:space="preserve">Step 6 — Sort salaryList and Show Top 3 Salaries</w:t>
       </w:r>
     </w:p>
     <w:p>
@@ -2305,21 +2295,21 @@
           <w:rFonts w:ascii="Times New Roman" w:hAnsi="Times New Roman"/>
           <w:sz w:val="24"/>
         </w:rPr>
-        <w:t xml:space="preserve">sort(reverse=True)</w:t>
-      </w:r>
-      <w:r>
-        <w:rPr>
-          <w:rFonts w:ascii="Times New Roman" w:hAnsi="Times New Roman"/>
-          <w:sz w:val="24"/>
-        </w:rPr>
-        <w:t xml:space="preserve"> </w:t>
-      </w:r>
-      <w:r>
-        <w:rPr>
-          <w:rFonts w:ascii="Times New Roman" w:hAnsi="Times New Roman"/>
-          <w:sz w:val="24"/>
-        </w:rPr>
-        <w:t xml:space="preserve">sorts</w:t>
+        <w:t xml:space="preserve">salaryList.sort(reverse=True)</w:t>
+      </w:r>
+      <w:r>
+        <w:rPr>
+          <w:rFonts w:ascii="Times New Roman" w:hAnsi="Times New Roman"/>
+          <w:sz w:val="24"/>
+        </w:rPr>
+        <w:t xml:space="preserve"> </w:t>
+      </w:r>
+      <w:r>
+        <w:rPr>
+          <w:rFonts w:ascii="Times New Roman" w:hAnsi="Times New Roman"/>
+          <w:sz w:val="24"/>
+        </w:rPr>
+        <w:t xml:space="preserve">sorts the list in descending order in place. A slice</w:t>
       </w:r>
       <w:r>
         <w:rPr>
@@ -2334,35 +2324,6 @@
           <w:rFonts w:ascii="Times New Roman" w:hAnsi="Times New Roman"/>
           <w:sz w:val="24"/>
         </w:rPr>
-        <w:t xml:space="preserve">salaryList</w:t>
-      </w:r>
-      <w:r>
-        <w:rPr>
-          <w:rFonts w:ascii="Times New Roman" w:hAnsi="Times New Roman"/>
-          <w:sz w:val="24"/>
-        </w:rPr>
-        <w:t xml:space="preserve"> </w:t>
-      </w:r>
-      <w:r>
-        <w:rPr>
-          <w:rFonts w:ascii="Times New Roman" w:hAnsi="Times New Roman"/>
-          <w:sz w:val="24"/>
-        </w:rPr>
-        <w:t xml:space="preserve">in descending order in place. A slice</w:t>
-      </w:r>
-      <w:r>
-        <w:rPr>
-          <w:rFonts w:ascii="Times New Roman" w:hAnsi="Times New Roman"/>
-          <w:sz w:val="24"/>
-        </w:rPr>
-        <w:t xml:space="preserve"> </w:t>
-      </w:r>
-      <w:r>
-        <w:rPr>
-          <w:rStyle w:val="VerbatimChar"/>
-          <w:rFonts w:ascii="Times New Roman" w:hAnsi="Times New Roman"/>
-          <w:sz w:val="24"/>
-        </w:rPr>
         <w:t xml:space="preserve">[:3]</w:t>
       </w:r>
       <w:r>
@@ -2377,7 +2338,7 @@
           <w:rFonts w:ascii="Times New Roman" w:hAnsi="Times New Roman"/>
           <w:sz w:val="24"/>
         </w:rPr>
-        <w:t xml:space="preserve">then extracts the first three elements — the three highest salaries.</w:t>
+        <w:t xml:space="preserve">then extracts the first three elements — the three highest post-raise salaries.</w:t>
       </w:r>
     </w:p>
     <w:p>
@@ -2519,7 +2480,7 @@
           <w:rFonts w:ascii="Times New Roman" w:hAnsi="Times New Roman"/>
           <w:sz w:val="24"/>
         </w:rPr>
-        <w:t xml:space="preserve">The top three salaries after the 4% raise are $85,280.00, $75,920.00, and $70,720.00.</w:t>
+        <w:t xml:space="preserve">After the 4% raise, the three highest salaries are $85,280.00 (Henry Brown), $75,920.00 (David Lee), and $70,720.00 (Frank Wilson).</w:t>
       </w:r>
     </w:p>
     <w:p>
@@ -2536,9 +2497,9 @@
         </w:pict>
       </w:r>
     </w:p>
+    <w:bookmarkEnd w:id="14"/>
     <w:bookmarkEnd w:id="15"/>
-    <w:bookmarkEnd w:id="16"/>
-    <w:bookmarkStart w:id="19" w:name="part-b-sentence-to-reversed-word-list"/>
+    <w:bookmarkStart w:id="17" w:name="part-b-sentence-to-reversed-word-list"/>
     <w:p>
       <w:pPr>
         <w:pStyle w:val="Heading2"/>
@@ -2552,20 +2513,6 @@
         <w:t xml:space="preserve">Part (b): Sentence to Reversed Word List</w:t>
       </w:r>
     </w:p>
-    <w:bookmarkStart w:id="17" w:name="overview-1"/>
-    <w:p>
-      <w:pPr>
-        <w:pStyle w:val="Heading3"/>
-        <w:spacing w:line="480" w:lineRule="auto"/>
-      </w:pPr>
-      <w:r>
-        <w:rPr>
-          <w:rFonts w:ascii="Times New Roman" w:hAnsi="Times New Roman"/>
-          <w:sz w:val="24"/>
-        </w:rPr>
-        <w:t xml:space="preserve">Overview</w:t>
-      </w:r>
-    </w:p>
     <w:p>
       <w:pPr>
         <w:pStyle w:val="FirstParagraph"/>
@@ -2576,7 +2523,7 @@
           <w:rFonts w:ascii="Times New Roman" w:hAnsi="Times New Roman"/>
           <w:sz w:val="24"/>
         </w:rPr>
-        <w:t xml:space="preserve">This section uses</w:t>
+        <w:t xml:space="preserve">This section converts a sentence string into a list of words using</w:t>
       </w:r>
       <w:r>
         <w:rPr>
@@ -2598,14 +2545,7 @@
           <w:rFonts w:ascii="Times New Roman" w:hAnsi="Times New Roman"/>
           <w:sz w:val="24"/>
         </w:rPr>
-        <w:t xml:space="preserve"> </w:t>
-      </w:r>
-      <w:r>
-        <w:rPr>
-          <w:rFonts w:ascii="Times New Roman" w:hAnsi="Times New Roman"/>
-          <w:sz w:val="24"/>
-        </w:rPr>
-        <w:t xml:space="preserve">to convert a sentence string into a list of words, then</w:t>
+        <w:t xml:space="preserve">, then reverses that list in place using</w:t>
       </w:r>
       <w:r>
         <w:rPr>
@@ -2627,14 +2567,7 @@
           <w:rFonts w:ascii="Times New Roman" w:hAnsi="Times New Roman"/>
           <w:sz w:val="24"/>
         </w:rPr>
-        <w:t xml:space="preserve"> </w:t>
-      </w:r>
-      <w:r>
-        <w:rPr>
-          <w:rFonts w:ascii="Times New Roman" w:hAnsi="Times New Roman"/>
-          <w:sz w:val="24"/>
-        </w:rPr>
-        <w:t xml:space="preserve">to reverse the list in place. This demonstrates the relationship between strings and lists, and the use of in-place list methods (Downey, 2015, p. 102).</w:t>
+        <w:t xml:space="preserve">. It demonstrates the string-to-list relationship and the behaviour of in-place list methods.</w:t>
       </w:r>
     </w:p>
     <w:p>
@@ -2683,6 +2616,28 @@
       </w:r>
       <w:r>
         <w:rPr>
+          <w:rFonts w:ascii="Times New Roman" w:hAnsi="Times New Roman"/>
+          <w:sz w:val="24"/>
+        </w:rPr>
+        <w:br/>
+      </w:r>
+      <w:r>
+        <w:rPr>
+          <w:rStyle w:val="CommentTok"/>
+          <w:rFonts w:ascii="Times New Roman" w:hAnsi="Times New Roman"/>
+          <w:sz w:val="24"/>
+        </w:rPr>
+        <w:t xml:space="preserve"># split() breaks the string on whitespace, returning a list of words</w:t>
+      </w:r>
+      <w:r>
+        <w:rPr>
+          <w:rFonts w:ascii="Times New Roman" w:hAnsi="Times New Roman"/>
+          <w:sz w:val="24"/>
+        </w:rPr>
+        <w:br/>
+      </w:r>
+      <w:r>
+        <w:rPr>
           <w:rStyle w:val="NormalTok"/>
           <w:rFonts w:ascii="Times New Roman" w:hAnsi="Times New Roman"/>
           <w:sz w:val="24"/>
@@ -2750,6 +2705,21 @@
           <w:sz w:val="24"/>
         </w:rPr>
         <w:br/>
+      </w:r>
+      <w:r>
+        <w:rPr>
+          <w:rFonts w:ascii="Times New Roman" w:hAnsi="Times New Roman"/>
+          <w:sz w:val="24"/>
+        </w:rPr>
+        <w:br/>
+      </w:r>
+      <w:r>
+        <w:rPr>
+          <w:rStyle w:val="CommentTok"/>
+          <w:rFonts w:ascii="Times New Roman" w:hAnsi="Times New Roman"/>
+          <w:sz w:val="24"/>
+        </w:rPr>
+        <w:t xml:space="preserve"># reverse() reverses the list in place and returns None</w:t>
       </w:r>
       <w:r>
         <w:rPr>
@@ -2857,8 +2827,7 @@
         <w:t xml:space="preserve">Reversed word list: ['flexible', 'and', 'powerful', 'are', 'lists', 'Python']</w:t>
       </w:r>
     </w:p>
-    <w:bookmarkEnd w:id="17"/>
-    <w:bookmarkStart w:id="18" w:name="technical-explanation"/>
+    <w:bookmarkStart w:id="16" w:name="technical-explanation"/>
     <w:p>
       <w:pPr>
         <w:pStyle w:val="Heading3"/>
@@ -2897,7 +2866,7 @@
           <w:rFonts w:ascii="Times New Roman" w:hAnsi="Times New Roman"/>
           <w:sz w:val="24"/>
         </w:rPr>
-        <w:t xml:space="preserve">with no argument splits on any whitespace, returning a list where each word is a separate string element. The result is</w:t>
+        <w:t xml:space="preserve">called with no argument splits on any whitespace character (spaces, tabs, newlines) and returns a new list where each word is a separate string element. The six-word sentence produces a six-element list:</w:t>
       </w:r>
       <w:r>
         <w:rPr>
@@ -2919,14 +2888,7 @@
           <w:rFonts w:ascii="Times New Roman" w:hAnsi="Times New Roman"/>
           <w:sz w:val="24"/>
         </w:rPr>
-        <w:t xml:space="preserve"> </w:t>
-      </w:r>
-      <w:r>
-        <w:rPr>
-          <w:rFonts w:ascii="Times New Roman" w:hAnsi="Times New Roman"/>
-          <w:sz w:val="24"/>
-        </w:rPr>
-        <w:t xml:space="preserve">— a 6-element list.</w:t>
+        <w:t xml:space="preserve">.</w:t>
       </w:r>
     </w:p>
     <w:p>
@@ -2954,7 +2916,7 @@
           <w:rFonts w:ascii="Times New Roman" w:hAnsi="Times New Roman"/>
           <w:sz w:val="24"/>
         </w:rPr>
-        <w:t xml:space="preserve">reverses the list in place, meaning it modifies the original list object directly and returns</w:t>
+        <w:t xml:space="preserve">is an in-place method — it rearranges the elements of the existing list object directly, without creating a new list, and returns</w:t>
       </w:r>
       <w:r>
         <w:rPr>
@@ -2976,63 +2938,44 @@
           <w:rFonts w:ascii="Times New Roman" w:hAnsi="Times New Roman"/>
           <w:sz w:val="24"/>
         </w:rPr>
-        <w:t xml:space="preserve">. The last word</w:t>
-      </w:r>
-      <w:r>
-        <w:rPr>
-          <w:rFonts w:ascii="Times New Roman" w:hAnsi="Times New Roman"/>
-          <w:sz w:val="24"/>
-        </w:rPr>
-        <w:t xml:space="preserve"> </w:t>
-      </w:r>
-      <w:r>
-        <w:rPr>
-          <w:rFonts w:ascii="Times New Roman" w:hAnsi="Times New Roman"/>
-          <w:sz w:val="24"/>
-        </w:rPr>
-        <w:t xml:space="preserve">‘flexible’</w:t>
-      </w:r>
-      <w:r>
-        <w:rPr>
-          <w:rFonts w:ascii="Times New Roman" w:hAnsi="Times New Roman"/>
-          <w:sz w:val="24"/>
-        </w:rPr>
-        <w:t xml:space="preserve"> </w:t>
-      </w:r>
-      <w:r>
-        <w:rPr>
-          <w:rFonts w:ascii="Times New Roman" w:hAnsi="Times New Roman"/>
-          <w:sz w:val="24"/>
-        </w:rPr>
-        <w:t xml:space="preserve">becomes the first element, and</w:t>
-      </w:r>
-      <w:r>
-        <w:rPr>
-          <w:rFonts w:ascii="Times New Roman" w:hAnsi="Times New Roman"/>
-          <w:sz w:val="24"/>
-        </w:rPr>
-        <w:t xml:space="preserve"> </w:t>
-      </w:r>
-      <w:r>
-        <w:rPr>
-          <w:rFonts w:ascii="Times New Roman" w:hAnsi="Times New Roman"/>
-          <w:sz w:val="24"/>
-        </w:rPr>
-        <w:t xml:space="preserve">‘Python’</w:t>
-      </w:r>
-      <w:r>
-        <w:rPr>
-          <w:rFonts w:ascii="Times New Roman" w:hAnsi="Times New Roman"/>
-          <w:sz w:val="24"/>
-        </w:rPr>
-        <w:t xml:space="preserve"> </w:t>
-      </w:r>
-      <w:r>
-        <w:rPr>
-          <w:rFonts w:ascii="Times New Roman" w:hAnsi="Times New Roman"/>
-          <w:sz w:val="24"/>
-        </w:rPr>
-        <w:t xml:space="preserve">moves to the last position. This is the inverse of the original sentence’s word order.</w:t>
+        <w:t xml:space="preserve">. After the call, the element that was at the last index (index 5,</w:t>
+      </w:r>
+      <w:r>
+        <w:rPr>
+          <w:rFonts w:ascii="Times New Roman" w:hAnsi="Times New Roman"/>
+          <w:sz w:val="24"/>
+        </w:rPr>
+        <w:t xml:space="preserve"> </w:t>
+      </w:r>
+      <w:r>
+        <w:rPr>
+          <w:rStyle w:val="VerbatimChar"/>
+          <w:rFonts w:ascii="Times New Roman" w:hAnsi="Times New Roman"/>
+          <w:sz w:val="24"/>
+        </w:rPr>
+        <w:t xml:space="preserve">'flexible'</w:t>
+      </w:r>
+      <w:r>
+        <w:rPr>
+          <w:rFonts w:ascii="Times New Roman" w:hAnsi="Times New Roman"/>
+          <w:sz w:val="24"/>
+        </w:rPr>
+        <w:t xml:space="preserve">) moves to index 0, and the element at index 0 (</w:t>
+      </w:r>
+      <w:r>
+        <w:rPr>
+          <w:rStyle w:val="VerbatimChar"/>
+          <w:rFonts w:ascii="Times New Roman" w:hAnsi="Times New Roman"/>
+          <w:sz w:val="24"/>
+        </w:rPr>
+        <w:t xml:space="preserve">'Python'</w:t>
+      </w:r>
+      <w:r>
+        <w:rPr>
+          <w:rFonts w:ascii="Times New Roman" w:hAnsi="Times New Roman"/>
+          <w:sz w:val="24"/>
+        </w:rPr>
+        <w:t xml:space="preserve">) moves to index 5. Every element’s position is mirrored around the centre of the list.</w:t>
       </w:r>
     </w:p>
     <w:p>
@@ -3045,7 +2988,7 @@
           <w:rFonts w:ascii="Times New Roman" w:hAnsi="Times New Roman"/>
           <w:sz w:val="24"/>
         </w:rPr>
-        <w:t xml:space="preserve">The combination of</w:t>
+        <w:t xml:space="preserve">This pattern —</w:t>
       </w:r>
       <w:r>
         <w:rPr>
@@ -3074,7 +3017,7 @@
           <w:rFonts w:ascii="Times New Roman" w:hAnsi="Times New Roman"/>
           <w:sz w:val="24"/>
         </w:rPr>
-        <w:t xml:space="preserve">and</w:t>
+        <w:t xml:space="preserve">followed by</w:t>
       </w:r>
       <w:r>
         <w:rPr>
@@ -3103,7 +3046,58 @@
           <w:rFonts w:ascii="Times New Roman" w:hAnsi="Times New Roman"/>
           <w:sz w:val="24"/>
         </w:rPr>
-        <w:t xml:space="preserve">is a practical pattern for text processing tasks such as reversing sentence word order, checking palindromes at the word level, or reordering data fields in a pipeline.</w:t>
+        <w:t xml:space="preserve">— is a practical text-processing technique. It can be used to reverse the word order of a sentence, check whether a sentence reads the same forwards and backwards at the word level, or reorder structured data fields stored as delimited strings. Downey (2015) notes that</w:t>
+      </w:r>
+      <w:r>
+        <w:rPr>
+          <w:rFonts w:ascii="Times New Roman" w:hAnsi="Times New Roman"/>
+          <w:sz w:val="24"/>
+        </w:rPr>
+        <w:t xml:space="preserve"> </w:t>
+      </w:r>
+      <w:r>
+        <w:rPr>
+          <w:rStyle w:val="VerbatimChar"/>
+          <w:rFonts w:ascii="Times New Roman" w:hAnsi="Times New Roman"/>
+          <w:sz w:val="24"/>
+        </w:rPr>
+        <w:t xml:space="preserve">split()</w:t>
+      </w:r>
+      <w:r>
+        <w:rPr>
+          <w:rFonts w:ascii="Times New Roman" w:hAnsi="Times New Roman"/>
+          <w:sz w:val="24"/>
+        </w:rPr>
+        <w:t xml:space="preserve"> </w:t>
+      </w:r>
+      <w:r>
+        <w:rPr>
+          <w:rFonts w:ascii="Times New Roman" w:hAnsi="Times New Roman"/>
+          <w:sz w:val="24"/>
+        </w:rPr>
+        <w:t xml:space="preserve">is the inverse of</w:t>
+      </w:r>
+      <w:r>
+        <w:rPr>
+          <w:rFonts w:ascii="Times New Roman" w:hAnsi="Times New Roman"/>
+          <w:sz w:val="24"/>
+        </w:rPr>
+        <w:t xml:space="preserve"> </w:t>
+      </w:r>
+      <w:r>
+        <w:rPr>
+          <w:rStyle w:val="VerbatimChar"/>
+          <w:rFonts w:ascii="Times New Roman" w:hAnsi="Times New Roman"/>
+          <w:sz w:val="24"/>
+        </w:rPr>
+        <w:t xml:space="preserve">join()</w:t>
+      </w:r>
+      <w:r>
+        <w:rPr>
+          <w:rFonts w:ascii="Times New Roman" w:hAnsi="Times New Roman"/>
+          <w:sz w:val="24"/>
+        </w:rPr>
+        <w:t xml:space="preserve">, making it straightforward to convert between string and list representations of the same data (p. 102).</w:t>
       </w:r>
     </w:p>
     <w:p>
@@ -3120,9 +3114,9 @@
         </w:pict>
       </w:r>
     </w:p>
-    <w:bookmarkEnd w:id="18"/>
-    <w:bookmarkEnd w:id="19"/>
-    <w:bookmarkStart w:id="20" w:name="references"/>
+    <w:bookmarkEnd w:id="16"/>
+    <w:bookmarkEnd w:id="17"/>
+    <w:bookmarkStart w:id="18" w:name="references"/>
     <w:p>
       <w:pPr>
         <w:pStyle w:val="Heading2"/>
@@ -3205,11 +3199,11 @@
           <w:rFonts w:ascii="Times New Roman" w:hAnsi="Times New Roman"/>
           <w:sz w:val="24"/>
         </w:rPr>
-        <w:t xml:space="preserve">: ~750 words</w:t>
-      </w:r>
-    </w:p>
-    <w:bookmarkEnd w:id="20"/>
-    <w:bookmarkEnd w:id="21"/>
+        <w:t xml:space="preserve">: ~780 words</w:t>
+      </w:r>
+    </w:p>
+    <w:bookmarkEnd w:id="18"/>
+    <w:bookmarkEnd w:id="19"/>
     <w:sectPr>
       <w:footnotePr>
         <w:numRestart w:val="eachSect"/>

</xml_diff>